<commit_message>
Quản trị người dùng (Admin) + cập nhật hướng dẫn có hình ảnh
Module quản trị tài khoản đăng nhập (khác Nhân sự):
- API /api/users (+[id]): GET list (KHÔNG lộ passwordHash), POST tạo (email unique,
  bcrypt, gán roleCodes), PATCH đổi tên/vai trò/đặt lại mật khẩu/khóa-mở; chặn tự khóa.
  Gated bằng quyền user.manage (chỉ ADMIN). Validation userCreate/userUpdate.
- UI /users (Hệ thống → Quản trị người dùng): danh sách + thêm/sửa (email/tên/mật
  khẩu/đa vai trò/khóa-mở). Sidebar ẩn mục này với vai trò không có quyền.
- Không migration mới (dùng User/Role/UserRole sẵn có). Bump v0.9.0.

Hướng dẫn: docs/Huong-dan-su-dung-Sophia-Care.docx thêm mục 14 (Quản trị người dùng)
kèm ảnh chụp thật; renumber Phân quyền/Cập nhật/Mẹo → 15/16/17.

Xác thực: tsc sạch, lint 0 lỗi, build OK, 95 test pass (thêm 3 test quản trị người dùng).

Co-Authored-By: Claude Opus 4.8 <noreply@anthropic.com>
Claude-Session: https://claude.ai/code/session_01K4e5xHGiQ1Vor9CmnEkFSE
</commit_message>
<xml_diff>
--- a/docs/Huong-dan-su-dung-Sophia-Care.docx
+++ b/docs/Huong-dan-su-dung-Sophia-Care.docx
@@ -60,7 +60,7 @@
           <w:sz w:val="20"/>
           <w:szCs w:val="20"/>
         </w:rPr>
-        <w:t xml:space="preserve">Dành cho nhân viên · Phiên bản v0.8.0 · 13/08/2026</w:t>
+        <w:t xml:space="preserve">Dành cho nhân viên · Phiên bản v0.9.0 · 13/08/2026</w:t>
       </w:r>
     </w:p>
     <w:p>
@@ -4360,7 +4360,350 @@
         <w:spacing w:after="120" w:before="320"/>
       </w:pPr>
       <w:r>
-        <w:t xml:space="preserve">14. Phân quyền theo vai trò</w:t>
+        <w:t xml:space="preserve">14. Quản trị người dùng (tài khoản đăng nhập)</w:t>
+      </w:r>
+    </w:p>
+    <w:p>
+      <w:pPr>
+        <w:spacing w:after="100"/>
+      </w:pPr>
+      <w:r>
+        <w:rPr>
+          <w:color w:val="242019"/>
+          <w:sz w:val="22"/>
+          <w:szCs w:val="22"/>
+        </w:rPr>
+        <w:t xml:space="preserve">Menu </w:t>
+      </w:r>
+      <w:r>
+        <w:rPr>
+          <w:b/>
+          <w:bCs/>
+          <w:color w:val="242019"/>
+          <w:sz w:val="22"/>
+          <w:szCs w:val="22"/>
+        </w:rPr>
+        <w:t xml:space="preserve">Hệ thống → Quản trị người dùng</w:t>
+      </w:r>
+      <w:r>
+        <w:rPr>
+          <w:color w:val="242019"/>
+          <w:sz w:val="22"/>
+          <w:szCs w:val="22"/>
+        </w:rPr>
+        <w:t xml:space="preserve"> (</w:t>
+      </w:r>
+      <w:r>
+        <w:rPr>
+          <w:b/>
+          <w:bCs/>
+          <w:color w:val="242019"/>
+          <w:sz w:val="22"/>
+          <w:szCs w:val="22"/>
+        </w:rPr>
+        <w:t xml:space="preserve">chỉ tài khoản Admin</w:t>
+      </w:r>
+      <w:r>
+        <w:rPr>
+          <w:color w:val="242019"/>
+          <w:sz w:val="22"/>
+          <w:szCs w:val="22"/>
+        </w:rPr>
+        <w:t xml:space="preserve"> thấy menu này). Tạo tài khoản đăng nhập cho nhân viên, gán vai trò, đặt lại mật khẩu, khóa/mở.</w:t>
+      </w:r>
+    </w:p>
+    <w:p>
+      <w:pPr>
+        <w:pStyle w:val="ListParagraph"/>
+        <w:numPr>
+          <w:ilvl w:val="0"/>
+          <w:numId w:val="2"/>
+        </w:numPr>
+        <w:spacing w:after="40"/>
+      </w:pPr>
+      <w:r>
+        <w:rPr>
+          <w:color w:val="242019"/>
+          <w:sz w:val="22"/>
+          <w:szCs w:val="22"/>
+        </w:rPr>
+        <w:t xml:space="preserve">Bấm </w:t>
+      </w:r>
+      <w:r>
+        <w:rPr>
+          <w:b/>
+          <w:bCs/>
+          <w:color w:val="242019"/>
+          <w:sz w:val="22"/>
+          <w:szCs w:val="22"/>
+        </w:rPr>
+        <w:t xml:space="preserve">Thêm người dùng</w:t>
+      </w:r>
+      <w:r>
+        <w:rPr>
+          <w:color w:val="242019"/>
+          <w:sz w:val="22"/>
+          <w:szCs w:val="22"/>
+        </w:rPr>
+        <w:t xml:space="preserve"> → nhập </w:t>
+      </w:r>
+      <w:r>
+        <w:rPr>
+          <w:b/>
+          <w:bCs/>
+          <w:color w:val="242019"/>
+          <w:sz w:val="22"/>
+          <w:szCs w:val="22"/>
+        </w:rPr>
+        <w:t xml:space="preserve">email đăng nhập</w:t>
+      </w:r>
+      <w:r>
+        <w:rPr>
+          <w:color w:val="242019"/>
+          <w:sz w:val="22"/>
+          <w:szCs w:val="22"/>
+        </w:rPr>
+        <w:t xml:space="preserve">, họ tên, </w:t>
+      </w:r>
+      <w:r>
+        <w:rPr>
+          <w:b/>
+          <w:bCs/>
+          <w:color w:val="242019"/>
+          <w:sz w:val="22"/>
+          <w:szCs w:val="22"/>
+        </w:rPr>
+        <w:t xml:space="preserve">mật khẩu</w:t>
+      </w:r>
+      <w:r>
+        <w:rPr>
+          <w:color w:val="242019"/>
+          <w:sz w:val="22"/>
+          <w:szCs w:val="22"/>
+        </w:rPr>
+        <w:t xml:space="preserve">, chọn </w:t>
+      </w:r>
+      <w:r>
+        <w:rPr>
+          <w:b/>
+          <w:bCs/>
+          <w:color w:val="242019"/>
+          <w:sz w:val="22"/>
+          <w:szCs w:val="22"/>
+        </w:rPr>
+        <w:t xml:space="preserve">một hoặc nhiều vai trò</w:t>
+      </w:r>
+      <w:r>
+        <w:rPr>
+          <w:color w:val="242019"/>
+          <w:sz w:val="22"/>
+          <w:szCs w:val="22"/>
+        </w:rPr>
+        <w:t xml:space="preserve">.</w:t>
+      </w:r>
+    </w:p>
+    <w:p>
+      <w:pPr>
+        <w:pStyle w:val="ListParagraph"/>
+        <w:numPr>
+          <w:ilvl w:val="0"/>
+          <w:numId w:val="2"/>
+        </w:numPr>
+        <w:spacing w:after="40"/>
+      </w:pPr>
+      <w:r>
+        <w:rPr>
+          <w:color w:val="242019"/>
+          <w:sz w:val="22"/>
+          <w:szCs w:val="22"/>
+        </w:rPr>
+        <w:t xml:space="preserve">Bấm biểu tượng bút chì để </w:t>
+      </w:r>
+      <w:r>
+        <w:rPr>
+          <w:b/>
+          <w:bCs/>
+          <w:color w:val="242019"/>
+          <w:sz w:val="22"/>
+          <w:szCs w:val="22"/>
+        </w:rPr>
+        <w:t xml:space="preserve">sửa</w:t>
+      </w:r>
+      <w:r>
+        <w:rPr>
+          <w:color w:val="242019"/>
+          <w:sz w:val="22"/>
+          <w:szCs w:val="22"/>
+        </w:rPr>
+        <w:t xml:space="preserve">: đổi tên, </w:t>
+      </w:r>
+      <w:r>
+        <w:rPr>
+          <w:b/>
+          <w:bCs/>
+          <w:color w:val="242019"/>
+          <w:sz w:val="22"/>
+          <w:szCs w:val="22"/>
+        </w:rPr>
+        <w:t xml:space="preserve">đổi vai trò</w:t>
+      </w:r>
+      <w:r>
+        <w:rPr>
+          <w:color w:val="242019"/>
+          <w:sz w:val="22"/>
+          <w:szCs w:val="22"/>
+        </w:rPr>
+        <w:t xml:space="preserve">, </w:t>
+      </w:r>
+      <w:r>
+        <w:rPr>
+          <w:b/>
+          <w:bCs/>
+          <w:color w:val="242019"/>
+          <w:sz w:val="22"/>
+          <w:szCs w:val="22"/>
+        </w:rPr>
+        <w:t xml:space="preserve">đặt lại mật khẩu</w:t>
+      </w:r>
+      <w:r>
+        <w:rPr>
+          <w:color w:val="242019"/>
+          <w:sz w:val="22"/>
+          <w:szCs w:val="22"/>
+        </w:rPr>
+        <w:t xml:space="preserve"> (bỏ trống nếu giữ nguyên), </w:t>
+      </w:r>
+      <w:r>
+        <w:rPr>
+          <w:b/>
+          <w:bCs/>
+          <w:color w:val="242019"/>
+          <w:sz w:val="22"/>
+          <w:szCs w:val="22"/>
+        </w:rPr>
+        <w:t xml:space="preserve">khóa/mở</w:t>
+      </w:r>
+      <w:r>
+        <w:rPr>
+          <w:color w:val="242019"/>
+          <w:sz w:val="22"/>
+          <w:szCs w:val="22"/>
+        </w:rPr>
+        <w:t xml:space="preserve"> tài khoản.</w:t>
+      </w:r>
+    </w:p>
+    <w:p>
+      <w:pPr>
+        <w:pStyle w:val="ListParagraph"/>
+        <w:numPr>
+          <w:ilvl w:val="0"/>
+          <w:numId w:val="2"/>
+        </w:numPr>
+        <w:spacing w:after="40"/>
+      </w:pPr>
+      <w:r>
+        <w:rPr>
+          <w:color w:val="242019"/>
+          <w:sz w:val="22"/>
+          <w:szCs w:val="22"/>
+        </w:rPr>
+        <w:t xml:space="preserve">Tài khoản bị khóa sẽ không đăng nhập được. (Không thể tự khóa chính tài khoản đang dùng.)</w:t>
+      </w:r>
+    </w:p>
+    <w:p>
+      <w:pPr>
+        <w:pBdr>
+          <w:top w:val="single" w:color="DCD6CC" w:sz="4" w:space="4"/>
+          <w:bottom w:val="single" w:color="DCD6CC" w:sz="4" w:space="4"/>
+          <w:left w:val="single" w:color="DCD6CC" w:sz="4" w:space="4"/>
+          <w:right w:val="single" w:color="DCD6CC" w:sz="4" w:space="4"/>
+        </w:pBdr>
+        <w:spacing w:after="20" w:before="80"/>
+        <w:jc w:val="center"/>
+      </w:pPr>
+      <w:r>
+        <w:drawing>
+          <wp:inline distT="0" distB="0" distL="0" distR="0">
+            <wp:extent cx="5715000" cy="4057650"/>
+            <wp:effectExtent t="0" r="0" b="0" l="0"/>
+            <wp:docPr id="1" name="" descr="" title=""/>
+            <wp:cNvGraphicFramePr>
+              <a:graphicFrameLocks xmlns:a="http://schemas.openxmlformats.org/drawingml/2006/main" noChangeAspect="1"/>
+            </wp:cNvGraphicFramePr>
+            <a:graphic xmlns:a="http://schemas.openxmlformats.org/drawingml/2006/main">
+              <a:graphicData uri="http://schemas.openxmlformats.org/drawingml/2006/picture">
+                <pic:pic xmlns:pic="http://schemas.openxmlformats.org/drawingml/2006/picture">
+                  <pic:nvPicPr>
+                    <pic:cNvPr id="0" name="" descr=""/>
+                    <pic:cNvPicPr>
+                      <a:picLocks noChangeAspect="1" noChangeArrowheads="1"/>
+                    </pic:cNvPicPr>
+                  </pic:nvPicPr>
+                  <pic:blipFill>
+                    <a:blip r:embed="rId27" cstate="none"/>
+                    <a:srcRect/>
+                    <a:stretch>
+                      <a:fillRect/>
+                    </a:stretch>
+                  </pic:blipFill>
+                  <pic:spPr bwMode="auto">
+                    <a:xfrm>
+                      <a:off x="0" y="0"/>
+                      <a:ext cx="5715000" cy="4057650"/>
+                    </a:xfrm>
+                    <a:prstGeom prst="rect">
+                      <a:avLst/>
+                    </a:prstGeom>
+                  </pic:spPr>
+                </pic:pic>
+              </a:graphicData>
+            </a:graphic>
+          </wp:inline>
+        </w:drawing>
+      </w:r>
+    </w:p>
+    <w:p>
+      <w:pPr>
+        <w:spacing w:after="160"/>
+        <w:jc w:val="center"/>
+      </w:pPr>
+      <w:r>
+        <w:rPr>
+          <w:i/>
+          <w:iCs/>
+          <w:color w:val="6B6459"/>
+          <w:sz w:val="18"/>
+          <w:szCs w:val="18"/>
+        </w:rPr>
+        <w:t xml:space="preserve">▲ Quản trị người dùng: danh sách tài khoản + vai trò</w:t>
+      </w:r>
+    </w:p>
+    <w:p>
+      <w:pPr>
+        <w:pBdr>
+          <w:left w:val="single" w:color="4F7D6E" w:sz="18" w:space="12"/>
+        </w:pBdr>
+        <w:spacing w:after="120" w:before="60"/>
+        <w:ind w:left="200"/>
+      </w:pPr>
+      <w:r>
+        <w:rPr>
+          <w:i/>
+          <w:iCs/>
+          <w:color w:val="6B6459"/>
+          <w:sz w:val="20"/>
+          <w:szCs w:val="20"/>
+        </w:rPr>
+        <w:t xml:space="preserve">“Quản trị người dùng” là tài khoản ĐĂNG NHẬP (email + mật khẩu + vai trò). Khác với “Nhân sự” — danh mục nhân viên để phân công buổi/tính phí. Một người có thể vừa là nhân sự, vừa có tài khoản đăng nhập.</w:t>
+      </w:r>
+    </w:p>
+    <w:p>
+      <w:pPr>
+        <w:pStyle w:val="Heading1"/>
+        <w:spacing w:after="120" w:before="320"/>
+      </w:pPr>
+      <w:r>
+        <w:t xml:space="preserve">15. Phân quyền theo vai trò</w:t>
       </w:r>
     </w:p>
     <w:p>
@@ -4784,7 +5127,7 @@
         <w:spacing w:after="120" w:before="320"/>
       </w:pPr>
       <w:r>
-        <w:t xml:space="preserve">15. Cập nhật phần mềm (không mất dữ liệu)</w:t>
+        <w:t xml:space="preserve">16. Cập nhật phần mềm (không mất dữ liệu)</w:t>
       </w:r>
     </w:p>
     <w:p>
@@ -4976,7 +5319,7 @@
         <w:spacing w:after="120" w:before="320"/>
       </w:pPr>
       <w:r>
-        <w:t xml:space="preserve">16. Mẹo &amp; Xử lý sự cố thường gặp</w:t>
+        <w:t xml:space="preserve">17. Mẹo &amp; Xử lý sự cố thường gặp</w:t>
       </w:r>
     </w:p>
     <w:p>
@@ -5137,7 +5480,7 @@
           <w:sz w:val="18"/>
           <w:szCs w:val="18"/>
         </w:rPr>
-        <w:t xml:space="preserve">— Hết —  Sophia Care · Hướng dẫn sử dụng · v0.8.0 · 13/08/2026</w:t>
+        <w:t xml:space="preserve">— Hết —  Sophia Care · Hướng dẫn sử dụng · v0.9.0 · 13/08/2026</w:t>
       </w:r>
     </w:p>
     <w:sectPr>

</xml_diff>